<commit_message>
Add MongoDB to skills, change Google to OpenAI in Agentic AI partners
</commit_message>
<xml_diff>
--- a/Aslan_Wang_Resume.docx
+++ b/Aslan_Wang_Resume.docx
@@ -1721,7 +1721,7 @@
           <w:sz w:val="20"/>
           <w:szCs w:val="20"/>
         </w:rPr>
-        <w:t xml:space="preserve">Google</w:t>
+        <w:t xml:space="preserve">OpenAI</w:t>
       </w:r>
       <w:r>
         <w:rPr>
@@ -1876,7 +1876,7 @@
           <w:sz w:val="20"/>
           <w:szCs w:val="20"/>
         </w:rPr>
-        <w:t xml:space="preserve">: FastAPI, Node.js, React, Flask, Express, Next.js, Vite, Hono, SQLite</w:t>
+        <w:t xml:space="preserve">: FastAPI, Node.js, React, Flask, Express, Next.js, Vite, Hono, SQLite, MongoDB</w:t>
       </w:r>
     </w:p>
     <w:p>

</xml_diff>

<commit_message>
Update hackathon wins to 9x, swap SpartaHack for CalHacks 2026
</commit_message>
<xml_diff>
--- a/Aslan_Wang_Resume.docx
+++ b/Aslan_Wang_Resume.docx
@@ -230,15 +230,15 @@
           <w:sz w:val="20"/>
           <w:szCs w:val="20"/>
         </w:rPr>
-        <w:t xml:space="preserve">8x Hackathon Winner</w:t>
-      </w:r>
-      <w:r>
-        <w:rPr>
-          <w:rFonts w:ascii="Times New Roman" w:cs="Times New Roman" w:eastAsia="Times New Roman" w:hAnsi="Times New Roman"/>
-          <w:sz w:val="20"/>
-          <w:szCs w:val="20"/>
-        </w:rPr>
-        <w:t xml:space="preserve"> (MHacks 2026, YHack 2026, HackIllinois 2026, HooHacks 2026, SpartaHack 2026)</w:t>
+        <w:t xml:space="preserve">9x Hackathon Winner</w:t>
+      </w:r>
+      <w:r>
+        <w:rPr>
+          <w:rFonts w:ascii="Times New Roman" w:cs="Times New Roman" w:eastAsia="Times New Roman" w:hAnsi="Times New Roman"/>
+          <w:sz w:val="20"/>
+          <w:szCs w:val="20"/>
+        </w:rPr>
+        <w:t xml:space="preserve"> (MHacks 2026, YHack 2026, HackIllinois 2026, HooHacks 2026, CalHacks 2026)</w:t>
       </w:r>
     </w:p>
     <w:p>

</xml_diff>

<commit_message>
Move HackIllinois to Leadership above Agentic AI, replace Concepts with Databases in skills
Also syncs the Word version's HackIllinois bullet with main.tex (1,000+ participants).
</commit_message>
<xml_diff>
--- a/Aslan_Wang_Resume.docx
+++ b/Aslan_Wang_Resume.docx
@@ -263,146 +263,6 @@
         <w:tabs>
           <w:tab w:val="right" w:pos="10800"/>
         </w:tabs>
-        <w:spacing w:after="0" w:before="0"/>
-        <w:ind w:left="180"/>
-      </w:pPr>
-      <w:r>
-        <w:rPr>
-          <w:rFonts w:ascii="Times New Roman" w:cs="Times New Roman" w:eastAsia="Times New Roman" w:hAnsi="Times New Roman"/>
-          <w:b/>
-          <w:bCs/>
-          <w:sz w:val="21"/>
-          <w:szCs w:val="21"/>
-        </w:rPr>
-        <w:t xml:space="preserve">HackIllinois</w:t>
-      </w:r>
-      <w:r>
-        <w:rPr>
-          <w:rFonts w:ascii="Times New Roman" w:cs="Times New Roman" w:eastAsia="Times New Roman" w:hAnsi="Times New Roman"/>
-        </w:rPr>
-        <w:t xml:space="preserve">	</w:t>
-      </w:r>
-      <w:r>
-        <w:rPr>
-          <w:rFonts w:ascii="Times New Roman" w:cs="Times New Roman" w:eastAsia="Times New Roman" w:hAnsi="Times New Roman"/>
-          <w:sz w:val="21"/>
-          <w:szCs w:val="21"/>
-        </w:rPr>
-        <w:t xml:space="preserve">Sept. 2026 – Present</w:t>
-      </w:r>
-    </w:p>
-    <w:p>
-      <w:pPr>
-        <w:tabs>
-          <w:tab w:val="right" w:pos="10800"/>
-        </w:tabs>
-        <w:spacing w:after="0" w:before="0"/>
-        <w:ind w:left="180"/>
-      </w:pPr>
-      <w:r>
-        <w:rPr>
-          <w:rFonts w:ascii="Times New Roman" w:cs="Times New Roman" w:eastAsia="Times New Roman" w:hAnsi="Times New Roman"/>
-          <w:i/>
-          <w:iCs/>
-          <w:sz w:val="20"/>
-          <w:szCs w:val="20"/>
-        </w:rPr>
-        <w:t xml:space="preserve">Systems Team Staff</w:t>
-      </w:r>
-      <w:r>
-        <w:rPr>
-          <w:rFonts w:ascii="Times New Roman" w:cs="Times New Roman" w:eastAsia="Times New Roman" w:hAnsi="Times New Roman"/>
-        </w:rPr>
-        <w:t xml:space="preserve">	</w:t>
-      </w:r>
-      <w:r>
-        <w:rPr>
-          <w:rFonts w:ascii="Times New Roman" w:cs="Times New Roman" w:eastAsia="Times New Roman" w:hAnsi="Times New Roman"/>
-          <w:i/>
-          <w:iCs/>
-          <w:sz w:val="20"/>
-          <w:szCs w:val="20"/>
-        </w:rPr>
-        <w:t xml:space="preserve">Champaign, IL</w:t>
-      </w:r>
-    </w:p>
-    <w:p>
-      <w:pPr>
-        <w:pStyle w:val="ListParagraph"/>
-        <w:numPr>
-          <w:ilvl w:val="0"/>
-          <w:numId w:val="2"/>
-        </w:numPr>
-        <w:spacing w:after="0" w:before="0"/>
-      </w:pPr>
-      <w:r>
-        <w:rPr>
-          <w:rFonts w:ascii="Times New Roman" w:cs="Times New Roman" w:eastAsia="Times New Roman" w:hAnsi="Times New Roman"/>
-          <w:sz w:val="20"/>
-          <w:szCs w:val="20"/>
-        </w:rPr>
-        <w:t xml:space="preserve">Maintaining the </w:t>
-      </w:r>
-      <w:r>
-        <w:rPr>
-          <w:rFonts w:ascii="Times New Roman" w:cs="Times New Roman" w:eastAsia="Times New Roman" w:hAnsi="Times New Roman"/>
-          <w:b/>
-          <w:bCs/>
-          <w:sz w:val="20"/>
-          <w:szCs w:val="20"/>
-        </w:rPr>
-        <w:t xml:space="preserve">Next.js</w:t>
-      </w:r>
-      <w:r>
-        <w:rPr>
-          <w:rFonts w:ascii="Times New Roman" w:cs="Times New Roman" w:eastAsia="Times New Roman" w:hAnsi="Times New Roman"/>
-          <w:sz w:val="20"/>
-          <w:szCs w:val="20"/>
-        </w:rPr>
-        <w:t xml:space="preserve"> site, </w:t>
-      </w:r>
-      <w:r>
-        <w:rPr>
-          <w:rFonts w:ascii="Times New Roman" w:cs="Times New Roman" w:eastAsia="Times New Roman" w:hAnsi="Times New Roman"/>
-          <w:b/>
-          <w:bCs/>
-          <w:sz w:val="20"/>
-          <w:szCs w:val="20"/>
-        </w:rPr>
-        <w:t xml:space="preserve">React Native</w:t>
-      </w:r>
-      <w:r>
-        <w:rPr>
-          <w:rFonts w:ascii="Times New Roman" w:cs="Times New Roman" w:eastAsia="Times New Roman" w:hAnsi="Times New Roman"/>
-          <w:sz w:val="20"/>
-          <w:szCs w:val="20"/>
-        </w:rPr>
-        <w:t xml:space="preserve"> app, and </w:t>
-      </w:r>
-      <w:r>
-        <w:rPr>
-          <w:rFonts w:ascii="Times New Roman" w:cs="Times New Roman" w:eastAsia="Times New Roman" w:hAnsi="Times New Roman"/>
-          <w:b/>
-          <w:bCs/>
-          <w:sz w:val="20"/>
-          <w:szCs w:val="20"/>
-        </w:rPr>
-        <w:t xml:space="preserve">Express</w:t>
-      </w:r>
-      <w:r>
-        <w:rPr>
-          <w:rFonts w:ascii="Times New Roman" w:cs="Times New Roman" w:eastAsia="Times New Roman" w:hAnsi="Times New Roman"/>
-          <w:sz w:val="20"/>
-          <w:szCs w:val="20"/>
-        </w:rPr>
-        <w:t xml:space="preserve"> API for the Midwest's largest student hackathon</w:t>
-      </w:r>
-    </w:p>
-    <w:p>
-      <w:pPr>
-        <w:tabs>
-          <w:tab w:val="right" w:pos="10800"/>
-        </w:tabs>
         <w:spacing w:after="0" w:before="100"/>
         <w:ind w:left="180"/>
       </w:pPr>
@@ -1590,7 +1450,7 @@
           <w:sz w:val="21"/>
           <w:szCs w:val="21"/>
         </w:rPr>
-        <w:t xml:space="preserve">Agentic AI @ UIUC</w:t>
+        <w:t xml:space="preserve">HackIllinois</w:t>
       </w:r>
       <w:r>
         <w:rPr>
@@ -1604,7 +1464,7 @@
           <w:sz w:val="21"/>
           <w:szCs w:val="21"/>
         </w:rPr>
-        <w:t xml:space="preserve">May 2026 – Present</w:t>
+        <w:t xml:space="preserve">Sept. 2026 – Present</w:t>
       </w:r>
     </w:p>
     <w:p>
@@ -1623,7 +1483,7 @@
           <w:sz w:val="20"/>
           <w:szCs w:val="20"/>
         </w:rPr>
-        <w:t xml:space="preserve">Vice President</w:t>
+        <w:t xml:space="preserve">Systems Team Staff</w:t>
       </w:r>
       <w:r>
         <w:rPr>
@@ -1657,97 +1517,147 @@
           <w:sz w:val="20"/>
           <w:szCs w:val="20"/>
         </w:rPr>
-        <w:t xml:space="preserve">Partnered with </w:t>
-      </w:r>
-      <w:r>
-        <w:rPr>
-          <w:rFonts w:ascii="Times New Roman" w:cs="Times New Roman" w:eastAsia="Times New Roman" w:hAnsi="Times New Roman"/>
-          <w:b/>
-          <w:bCs/>
-          <w:sz w:val="20"/>
-          <w:szCs w:val="20"/>
-        </w:rPr>
-        <w:t xml:space="preserve">Microsoft</w:t>
-      </w:r>
-      <w:r>
-        <w:rPr>
-          <w:rFonts w:ascii="Times New Roman" w:cs="Times New Roman" w:eastAsia="Times New Roman" w:hAnsi="Times New Roman"/>
-          <w:sz w:val="20"/>
-          <w:szCs w:val="20"/>
-        </w:rPr>
-        <w:t xml:space="preserve">, </w:t>
-      </w:r>
-      <w:r>
-        <w:rPr>
-          <w:rFonts w:ascii="Times New Roman" w:cs="Times New Roman" w:eastAsia="Times New Roman" w:hAnsi="Times New Roman"/>
-          <w:b/>
-          <w:bCs/>
-          <w:sz w:val="20"/>
-          <w:szCs w:val="20"/>
-        </w:rPr>
-        <w:t xml:space="preserve">SpaceXAI</w:t>
-      </w:r>
-      <w:r>
-        <w:rPr>
-          <w:rFonts w:ascii="Times New Roman" w:cs="Times New Roman" w:eastAsia="Times New Roman" w:hAnsi="Times New Roman"/>
-          <w:sz w:val="20"/>
-          <w:szCs w:val="20"/>
-        </w:rPr>
-        <w:t xml:space="preserve">, </w:t>
-      </w:r>
-      <w:r>
-        <w:rPr>
-          <w:rFonts w:ascii="Times New Roman" w:cs="Times New Roman" w:eastAsia="Times New Roman" w:hAnsi="Times New Roman"/>
-          <w:b/>
-          <w:bCs/>
-          <w:sz w:val="20"/>
-          <w:szCs w:val="20"/>
-        </w:rPr>
-        <w:t xml:space="preserve">Replit</w:t>
-      </w:r>
-      <w:r>
-        <w:rPr>
-          <w:rFonts w:ascii="Times New Roman" w:cs="Times New Roman" w:eastAsia="Times New Roman" w:hAnsi="Times New Roman"/>
-          <w:sz w:val="20"/>
-          <w:szCs w:val="20"/>
-        </w:rPr>
-        <w:t xml:space="preserve">, and </w:t>
-      </w:r>
-      <w:r>
-        <w:rPr>
-          <w:rFonts w:ascii="Times New Roman" w:cs="Times New Roman" w:eastAsia="Times New Roman" w:hAnsi="Times New Roman"/>
-          <w:b/>
-          <w:bCs/>
-          <w:sz w:val="20"/>
-          <w:szCs w:val="20"/>
-        </w:rPr>
-        <w:t xml:space="preserve">OpenAI</w:t>
-      </w:r>
-      <w:r>
-        <w:rPr>
-          <w:rFonts w:ascii="Times New Roman" w:cs="Times New Roman" w:eastAsia="Times New Roman" w:hAnsi="Times New Roman"/>
-          <w:sz w:val="20"/>
-          <w:szCs w:val="20"/>
-        </w:rPr>
-        <w:t xml:space="preserve"> on AI build nights for </w:t>
-      </w:r>
-      <w:r>
-        <w:rPr>
-          <w:rFonts w:ascii="Times New Roman" w:cs="Times New Roman" w:eastAsia="Times New Roman" w:hAnsi="Times New Roman"/>
-          <w:b/>
-          <w:bCs/>
-          <w:sz w:val="20"/>
-          <w:szCs w:val="20"/>
-        </w:rPr>
-        <w:t xml:space="preserve">600+</w:t>
-      </w:r>
-      <w:r>
-        <w:rPr>
-          <w:rFonts w:ascii="Times New Roman" w:cs="Times New Roman" w:eastAsia="Times New Roman" w:hAnsi="Times New Roman"/>
-          <w:sz w:val="20"/>
-          <w:szCs w:val="20"/>
-        </w:rPr>
-        <w:t xml:space="preserve"> members</w:t>
+        <w:t xml:space="preserve">Maintaining the </w:t>
+      </w:r>
+      <w:r>
+        <w:rPr>
+          <w:rFonts w:ascii="Times New Roman" w:cs="Times New Roman" w:eastAsia="Times New Roman" w:hAnsi="Times New Roman"/>
+          <w:b/>
+          <w:bCs/>
+          <w:sz w:val="20"/>
+          <w:szCs w:val="20"/>
+        </w:rPr>
+        <w:t xml:space="preserve">Next.js</w:t>
+      </w:r>
+      <w:r>
+        <w:rPr>
+          <w:rFonts w:ascii="Times New Roman" w:cs="Times New Roman" w:eastAsia="Times New Roman" w:hAnsi="Times New Roman"/>
+          <w:sz w:val="20"/>
+          <w:szCs w:val="20"/>
+        </w:rPr>
+        <w:t xml:space="preserve"> site, </w:t>
+      </w:r>
+      <w:r>
+        <w:rPr>
+          <w:rFonts w:ascii="Times New Roman" w:cs="Times New Roman" w:eastAsia="Times New Roman" w:hAnsi="Times New Roman"/>
+          <w:b/>
+          <w:bCs/>
+          <w:sz w:val="20"/>
+          <w:szCs w:val="20"/>
+        </w:rPr>
+        <w:t xml:space="preserve">React Native</w:t>
+      </w:r>
+      <w:r>
+        <w:rPr>
+          <w:rFonts w:ascii="Times New Roman" w:cs="Times New Roman" w:eastAsia="Times New Roman" w:hAnsi="Times New Roman"/>
+          <w:sz w:val="20"/>
+          <w:szCs w:val="20"/>
+        </w:rPr>
+        <w:t xml:space="preserve"> app, and </w:t>
+      </w:r>
+      <w:r>
+        <w:rPr>
+          <w:rFonts w:ascii="Times New Roman" w:cs="Times New Roman" w:eastAsia="Times New Roman" w:hAnsi="Times New Roman"/>
+          <w:b/>
+          <w:bCs/>
+          <w:sz w:val="20"/>
+          <w:szCs w:val="20"/>
+        </w:rPr>
+        <w:t xml:space="preserve">Express</w:t>
+      </w:r>
+      <w:r>
+        <w:rPr>
+          <w:rFonts w:ascii="Times New Roman" w:cs="Times New Roman" w:eastAsia="Times New Roman" w:hAnsi="Times New Roman"/>
+          <w:sz w:val="20"/>
+          <w:szCs w:val="20"/>
+        </w:rPr>
+        <w:t xml:space="preserve"> API serving </w:t>
+      </w:r>
+      <w:r>
+        <w:rPr>
+          <w:rFonts w:ascii="Times New Roman" w:cs="Times New Roman" w:eastAsia="Times New Roman" w:hAnsi="Times New Roman"/>
+          <w:b/>
+          <w:bCs/>
+          <w:sz w:val="20"/>
+          <w:szCs w:val="20"/>
+        </w:rPr>
+        <w:t xml:space="preserve">1,000+</w:t>
+      </w:r>
+      <w:r>
+        <w:rPr>
+          <w:rFonts w:ascii="Times New Roman" w:cs="Times New Roman" w:eastAsia="Times New Roman" w:hAnsi="Times New Roman"/>
+          <w:sz w:val="20"/>
+          <w:szCs w:val="20"/>
+        </w:rPr>
+        <w:t xml:space="preserve"> participants at the Midwest's largest student hackathon</w:t>
+      </w:r>
+    </w:p>
+    <w:p>
+      <w:pPr>
+        <w:tabs>
+          <w:tab w:val="right" w:pos="10800"/>
+        </w:tabs>
+        <w:spacing w:after="0" w:before="0"/>
+        <w:ind w:left="180"/>
+      </w:pPr>
+      <w:r>
+        <w:rPr>
+          <w:rFonts w:ascii="Times New Roman" w:cs="Times New Roman" w:eastAsia="Times New Roman" w:hAnsi="Times New Roman"/>
+          <w:b/>
+          <w:bCs/>
+          <w:sz w:val="21"/>
+          <w:szCs w:val="21"/>
+        </w:rPr>
+        <w:t xml:space="preserve">Agentic AI @ UIUC</w:t>
+      </w:r>
+      <w:r>
+        <w:rPr>
+          <w:rFonts w:ascii="Times New Roman" w:cs="Times New Roman" w:eastAsia="Times New Roman" w:hAnsi="Times New Roman"/>
+        </w:rPr>
+        <w:t xml:space="preserve">	</w:t>
+      </w:r>
+      <w:r>
+        <w:rPr>
+          <w:rFonts w:ascii="Times New Roman" w:cs="Times New Roman" w:eastAsia="Times New Roman" w:hAnsi="Times New Roman"/>
+          <w:sz w:val="21"/>
+          <w:szCs w:val="21"/>
+        </w:rPr>
+        <w:t xml:space="preserve">May 2026 – Present</w:t>
+      </w:r>
+    </w:p>
+    <w:p>
+      <w:pPr>
+        <w:tabs>
+          <w:tab w:val="right" w:pos="10800"/>
+        </w:tabs>
+        <w:spacing w:after="0" w:before="0"/>
+        <w:ind w:left="180"/>
+      </w:pPr>
+      <w:r>
+        <w:rPr>
+          <w:rFonts w:ascii="Times New Roman" w:cs="Times New Roman" w:eastAsia="Times New Roman" w:hAnsi="Times New Roman"/>
+          <w:i/>
+          <w:iCs/>
+          <w:sz w:val="20"/>
+          <w:szCs w:val="20"/>
+        </w:rPr>
+        <w:t xml:space="preserve">Vice President</w:t>
+      </w:r>
+      <w:r>
+        <w:rPr>
+          <w:rFonts w:ascii="Times New Roman" w:cs="Times New Roman" w:eastAsia="Times New Roman" w:hAnsi="Times New Roman"/>
+        </w:rPr>
+        <w:t xml:space="preserve">	</w:t>
+      </w:r>
+      <w:r>
+        <w:rPr>
+          <w:rFonts w:ascii="Times New Roman" w:cs="Times New Roman" w:eastAsia="Times New Roman" w:hAnsi="Times New Roman"/>
+          <w:i/>
+          <w:iCs/>
+          <w:sz w:val="20"/>
+          <w:szCs w:val="20"/>
+        </w:rPr>
+        <w:t xml:space="preserve">Champaign, IL</w:t>
       </w:r>
     </w:p>
     <w:p>
@@ -1765,25 +1675,97 @@
           <w:sz w:val="20"/>
           <w:szCs w:val="20"/>
         </w:rPr>
-        <w:t xml:space="preserve">Secured sponsors including </w:t>
-      </w:r>
-      <w:r>
-        <w:rPr>
-          <w:rFonts w:ascii="Times New Roman" w:cs="Times New Roman" w:eastAsia="Times New Roman" w:hAnsi="Times New Roman"/>
-          <w:b/>
-          <w:bCs/>
-          <w:sz w:val="20"/>
-          <w:szCs w:val="20"/>
-        </w:rPr>
-        <w:t xml:space="preserve">Optiver</w:t>
-      </w:r>
-      <w:r>
-        <w:rPr>
-          <w:rFonts w:ascii="Times New Roman" w:cs="Times New Roman" w:eastAsia="Times New Roman" w:hAnsi="Times New Roman"/>
-          <w:sz w:val="20"/>
-          <w:szCs w:val="20"/>
-        </w:rPr>
-        <w:t xml:space="preserve"> and ran AI workshops at other UIUC orgs' hackathons</w:t>
+        <w:t xml:space="preserve">Partnered with </w:t>
+      </w:r>
+      <w:r>
+        <w:rPr>
+          <w:rFonts w:ascii="Times New Roman" w:cs="Times New Roman" w:eastAsia="Times New Roman" w:hAnsi="Times New Roman"/>
+          <w:b/>
+          <w:bCs/>
+          <w:sz w:val="20"/>
+          <w:szCs w:val="20"/>
+        </w:rPr>
+        <w:t xml:space="preserve">Microsoft</w:t>
+      </w:r>
+      <w:r>
+        <w:rPr>
+          <w:rFonts w:ascii="Times New Roman" w:cs="Times New Roman" w:eastAsia="Times New Roman" w:hAnsi="Times New Roman"/>
+          <w:sz w:val="20"/>
+          <w:szCs w:val="20"/>
+        </w:rPr>
+        <w:t xml:space="preserve">, </w:t>
+      </w:r>
+      <w:r>
+        <w:rPr>
+          <w:rFonts w:ascii="Times New Roman" w:cs="Times New Roman" w:eastAsia="Times New Roman" w:hAnsi="Times New Roman"/>
+          <w:b/>
+          <w:bCs/>
+          <w:sz w:val="20"/>
+          <w:szCs w:val="20"/>
+        </w:rPr>
+        <w:t xml:space="preserve">SpaceXAI</w:t>
+      </w:r>
+      <w:r>
+        <w:rPr>
+          <w:rFonts w:ascii="Times New Roman" w:cs="Times New Roman" w:eastAsia="Times New Roman" w:hAnsi="Times New Roman"/>
+          <w:sz w:val="20"/>
+          <w:szCs w:val="20"/>
+        </w:rPr>
+        <w:t xml:space="preserve">, </w:t>
+      </w:r>
+      <w:r>
+        <w:rPr>
+          <w:rFonts w:ascii="Times New Roman" w:cs="Times New Roman" w:eastAsia="Times New Roman" w:hAnsi="Times New Roman"/>
+          <w:b/>
+          <w:bCs/>
+          <w:sz w:val="20"/>
+          <w:szCs w:val="20"/>
+        </w:rPr>
+        <w:t xml:space="preserve">Replit</w:t>
+      </w:r>
+      <w:r>
+        <w:rPr>
+          <w:rFonts w:ascii="Times New Roman" w:cs="Times New Roman" w:eastAsia="Times New Roman" w:hAnsi="Times New Roman"/>
+          <w:sz w:val="20"/>
+          <w:szCs w:val="20"/>
+        </w:rPr>
+        <w:t xml:space="preserve">, and </w:t>
+      </w:r>
+      <w:r>
+        <w:rPr>
+          <w:rFonts w:ascii="Times New Roman" w:cs="Times New Roman" w:eastAsia="Times New Roman" w:hAnsi="Times New Roman"/>
+          <w:b/>
+          <w:bCs/>
+          <w:sz w:val="20"/>
+          <w:szCs w:val="20"/>
+        </w:rPr>
+        <w:t xml:space="preserve">OpenAI</w:t>
+      </w:r>
+      <w:r>
+        <w:rPr>
+          <w:rFonts w:ascii="Times New Roman" w:cs="Times New Roman" w:eastAsia="Times New Roman" w:hAnsi="Times New Roman"/>
+          <w:sz w:val="20"/>
+          <w:szCs w:val="20"/>
+        </w:rPr>
+        <w:t xml:space="preserve"> on AI build nights for </w:t>
+      </w:r>
+      <w:r>
+        <w:rPr>
+          <w:rFonts w:ascii="Times New Roman" w:cs="Times New Roman" w:eastAsia="Times New Roman" w:hAnsi="Times New Roman"/>
+          <w:b/>
+          <w:bCs/>
+          <w:sz w:val="20"/>
+          <w:szCs w:val="20"/>
+        </w:rPr>
+        <w:t xml:space="preserve">600+</w:t>
+      </w:r>
+      <w:r>
+        <w:rPr>
+          <w:rFonts w:ascii="Times New Roman" w:cs="Times New Roman" w:eastAsia="Times New Roman" w:hAnsi="Times New Roman"/>
+          <w:sz w:val="20"/>
+          <w:szCs w:val="20"/>
+        </w:rPr>
+        <w:t xml:space="preserve"> members</w:t>
       </w:r>
     </w:p>
     <w:p>
@@ -1801,6 +1783,42 @@
           <w:sz w:val="20"/>
           <w:szCs w:val="20"/>
         </w:rPr>
+        <w:t xml:space="preserve">Secured sponsors including </w:t>
+      </w:r>
+      <w:r>
+        <w:rPr>
+          <w:rFonts w:ascii="Times New Roman" w:cs="Times New Roman" w:eastAsia="Times New Roman" w:hAnsi="Times New Roman"/>
+          <w:b/>
+          <w:bCs/>
+          <w:sz w:val="20"/>
+          <w:szCs w:val="20"/>
+        </w:rPr>
+        <w:t xml:space="preserve">Optiver</w:t>
+      </w:r>
+      <w:r>
+        <w:rPr>
+          <w:rFonts w:ascii="Times New Roman" w:cs="Times New Roman" w:eastAsia="Times New Roman" w:hAnsi="Times New Roman"/>
+          <w:sz w:val="20"/>
+          <w:szCs w:val="20"/>
+        </w:rPr>
+        <w:t xml:space="preserve"> and ran AI workshops at other UIUC orgs' hackathons</w:t>
+      </w:r>
+    </w:p>
+    <w:p>
+      <w:pPr>
+        <w:pStyle w:val="ListParagraph"/>
+        <w:numPr>
+          <w:ilvl w:val="0"/>
+          <w:numId w:val="2"/>
+        </w:numPr>
+        <w:spacing w:after="0" w:before="0"/>
+      </w:pPr>
+      <w:r>
+        <w:rPr>
+          <w:rFonts w:ascii="Times New Roman" w:cs="Times New Roman" w:eastAsia="Times New Roman" w:hAnsi="Times New Roman"/>
+          <w:sz w:val="20"/>
+          <w:szCs w:val="20"/>
+        </w:rPr>
         <w:t xml:space="preserve">Interviewed and staffed student project teams to build features for </w:t>
       </w:r>
       <w:r>
@@ -1876,7 +1894,7 @@
           <w:sz w:val="20"/>
           <w:szCs w:val="20"/>
         </w:rPr>
-        <w:t xml:space="preserve">: FastAPI, Node.js, React, Flask, Express, Next.js, Vite, Hono, SQLite, MongoDB</w:t>
+        <w:t xml:space="preserve">: FastAPI, Node.js, React, Flask, Express, Next.js, Vite, Hono</w:t>
       </w:r>
     </w:p>
     <w:p>
@@ -1900,7 +1918,7 @@
           <w:sz w:val="20"/>
           <w:szCs w:val="20"/>
         </w:rPr>
-        <w:t xml:space="preserve">: Git, AWS, Docker, Kubernetes, Firebase, Cloudflare Workers, Vercel, Railway, PostgreSQL, Neon</w:t>
+        <w:t xml:space="preserve">: Git, AWS, Docker, Kubernetes, Firebase, Cloudflare Workers, Vercel, Railway</w:t>
       </w:r>
     </w:p>
     <w:p>
@@ -1916,15 +1934,15 @@
           <w:sz w:val="20"/>
           <w:szCs w:val="20"/>
         </w:rPr>
-        <w:t xml:space="preserve">Concepts</w:t>
-      </w:r>
-      <w:r>
-        <w:rPr>
-          <w:rFonts w:ascii="Times New Roman" w:cs="Times New Roman" w:eastAsia="Times New Roman" w:hAnsi="Times New Roman"/>
-          <w:sz w:val="20"/>
-          <w:szCs w:val="20"/>
-        </w:rPr>
-        <w:t xml:space="preserve">: Software Engineering, Frontend, Backend, Full-Stack, LLM Orchestration, Machine Learning</w:t>
+        <w:t xml:space="preserve">Databases</w:t>
+      </w:r>
+      <w:r>
+        <w:rPr>
+          <w:rFonts w:ascii="Times New Roman" w:cs="Times New Roman" w:eastAsia="Times New Roman" w:hAnsi="Times New Roman"/>
+          <w:sz w:val="20"/>
+          <w:szCs w:val="20"/>
+        </w:rPr>
+        <w:t xml:space="preserve">: PostgreSQL, SQLite, MongoDB, Neon</w:t>
       </w:r>
     </w:p>
     <w:sectPr>

</xml_diff>